<commit_message>
Refait la génération des devis
Co-authored-by: nanouf69 <271506975+nanouf69@users.noreply.github.com>
</commit_message>
<xml_diff>
--- a/public/devis/Devis_Ta_elearning.docx
+++ b/public/devis/Devis_Ta_elearning.docx
@@ -588,6 +588,14 @@
               </w:rPr>
               <w:t/>
             </w:r>
+            <w:r>
+              <w:rPr>
+                <w:rFonts w:asciiTheme="minorHAnsi" w:hAnsiTheme="minorHAnsi" w:cstheme="minorHAnsi"/>
+                <w:sz w:val="24"/>
+                <w:szCs w:val="24"/>
+              </w:rPr>
+              <w:t>{client_nom}</w:t>
+            </w:r>
           </w:p>
         </w:tc>
         <w:tc>
@@ -939,7 +947,7 @@
           <w:sz w:val="22"/>
           <w:lang w:eastAsia="en-US"/>
         </w:rPr>
-        <w:t>Fait à Lyon, le</w:t>
+        <w:t>Fait à Lyon, le {devis_date}</w:t>
       </w:r>
       <w:r>
         <w:rPr>
@@ -1306,7 +1314,7 @@
           <w:szCs w:val="24"/>
           <w:lang w:eastAsia="en-US"/>
         </w:rPr>
-        <w:t>:</w:t>
+        <w:t>: {client_tel}</w:t>
       </w:r>
       <w:r>
         <w:rPr>

</xml_diff>

<commit_message>
Fixed DOCX devis placeholders
Co-authored-by: nanouf69 <271506975+nanouf69@users.noreply.github.com>
</commit_message>
<xml_diff>
--- a/public/devis/Devis_Ta_elearning.docx
+++ b/public/devis/Devis_Ta_elearning.docx
@@ -1196,7 +1196,7 @@
           <w:szCs w:val="24"/>
           <w:lang w:eastAsia="en-US"/>
         </w:rPr>
-        <w:t xml:space="preserve">Prénom et Nom : </w:t>
+        <w:t xml:space="preserve">Prénom et Nom : {client_nom}</w:t>
       </w:r>
       <w:r>
         <w:rPr>
@@ -1229,7 +1229,7 @@
           <w:szCs w:val="24"/>
           <w:lang w:eastAsia="en-US"/>
         </w:rPr>
-        <w:t xml:space="preserve">Adresse personnelle : </w:t>
+        <w:t xml:space="preserve">Adresse personnelle : {client_adresse1}</w:t>
       </w:r>
     </w:p>
     <w:p>
@@ -1252,7 +1252,7 @@
           <w:szCs w:val="24"/>
           <w:lang w:eastAsia="en-US"/>
         </w:rPr>
-        <w:t xml:space="preserve">Code postal : </w:t>
+        <w:t xml:space="preserve">Code postal : {client_codep}</w:t>
       </w:r>
     </w:p>
     <w:p>
@@ -1278,7 +1278,7 @@
           <w:lang w:eastAsia="en-US"/>
         </w:rPr>
         <w:lastRenderedPageBreak/>
-        <w:t xml:space="preserve">Ville : </w:t>
+        <w:t xml:space="preserve">Ville : {client_ville}</w:t>
       </w:r>
     </w:p>
     <w:p>
@@ -1355,7 +1355,7 @@
           <w:szCs w:val="24"/>
           <w:lang w:eastAsia="en-US"/>
         </w:rPr>
-        <w:t>E-mail :</w:t>
+        <w:t>E-mail : {client_mail}</w:t>
       </w:r>
     </w:p>
     <w:p>

</xml_diff>